<commit_message>
refactor: update output file
</commit_message>
<xml_diff>
--- a/Experiment-3_BackPropogation/Output_Exp-3.docx
+++ b/Experiment-3_BackPropogation/Output_Exp-3.docx
@@ -13,18 +13,23 @@
         <w:t xml:space="preserve">Output:</w:t>
         <w:br w:type="textWrapping"/>
       </w:r>
+    </w:p>
+    <w:p>
+      <w:pPr>
+        <w:rPr/>
+      </w:pPr>
       <w:r>
         <w:rPr/>
         <w:drawing>
           <wp:inline distB="114300" distT="114300" distL="114300" distR="114300">
-            <wp:extent cx="3990975" cy="3372850"/>
+            <wp:extent cx="3681413" cy="2643065"/>
             <wp:effectExtent b="0" l="0" r="0" t="0"/>
-            <wp:docPr id="3" name="image1.png"/>
+            <wp:docPr id="5" name="image4.png"/>
             <a:graphic>
               <a:graphicData uri="http://schemas.openxmlformats.org/drawingml/2006/picture">
                 <pic:pic>
                   <pic:nvPicPr>
-                    <pic:cNvPr id="0" name="image1.png"/>
+                    <pic:cNvPr id="0" name="image4.png"/>
                     <pic:cNvPicPr preferRelativeResize="0"/>
                   </pic:nvPicPr>
                   <pic:blipFill>
@@ -37,7 +42,7 @@
                   <pic:spPr>
                     <a:xfrm>
                       <a:off x="0" y="0"/>
-                      <a:ext cx="3990975" cy="3372850"/>
+                      <a:ext cx="3681413" cy="2643065"/>
                     </a:xfrm>
                     <a:prstGeom prst="rect"/>
                     <a:ln/>
@@ -69,102 +74,57 @@
         <w:rPr/>
       </w:pPr>
       <w:r>
-        <w:rPr>
-          <w:rtl w:val="0"/>
-        </w:rPr>
-      </w:r>
-    </w:p>
-    <w:p>
-      <w:pPr>
-        <w:rPr/>
-      </w:pPr>
-      <w:r>
-        <w:rPr>
-          <w:rtl w:val="0"/>
-        </w:rPr>
-      </w:r>
-    </w:p>
-    <w:p>
-      <w:pPr>
-        <w:rPr/>
-      </w:pPr>
-      <w:r>
-        <w:rPr>
-          <w:rtl w:val="0"/>
-        </w:rPr>
-      </w:r>
-    </w:p>
-    <w:p>
-      <w:pPr>
-        <w:rPr/>
-      </w:pPr>
-      <w:r>
-        <w:rPr>
-          <w:rtl w:val="0"/>
-        </w:rPr>
-      </w:r>
-    </w:p>
-    <w:p>
-      <w:pPr>
-        <w:rPr/>
-      </w:pPr>
-      <w:r>
-        <w:rPr>
-          <w:rtl w:val="0"/>
-        </w:rPr>
-      </w:r>
-    </w:p>
-    <w:p>
-      <w:pPr>
-        <w:rPr/>
-      </w:pPr>
-      <w:r>
-        <w:rPr>
-          <w:rtl w:val="0"/>
-        </w:rPr>
-      </w:r>
-    </w:p>
-    <w:p>
-      <w:pPr>
-        <w:rPr/>
-      </w:pPr>
-      <w:r>
-        <w:rPr>
-          <w:rtl w:val="0"/>
-        </w:rPr>
-      </w:r>
-    </w:p>
-    <w:p>
-      <w:pPr>
-        <w:rPr/>
-      </w:pPr>
-      <w:r>
-        <w:rPr>
-          <w:rtl w:val="0"/>
-        </w:rPr>
-      </w:r>
-    </w:p>
-    <w:p>
-      <w:pPr>
-        <w:rPr/>
-      </w:pPr>
-      <w:r>
-        <w:rPr>
-          <w:rtl w:val="0"/>
-        </w:rPr>
-      </w:r>
-    </w:p>
-    <w:p>
-      <w:pPr>
-        <w:rPr/>
-      </w:pPr>
-      <w:r>
         <w:rPr/>
         <w:drawing>
           <wp:inline distB="114300" distT="114300" distL="114300" distR="114300">
-            <wp:extent cx="3048000" cy="4624388"/>
+            <wp:extent cx="4040958" cy="3348038"/>
             <wp:effectExtent b="0" l="0" r="0" t="0"/>
-            <wp:docPr id="2" name="image3.png"/>
+            <wp:docPr id="2" name="image1.png"/>
+            <a:graphic>
+              <a:graphicData uri="http://schemas.openxmlformats.org/drawingml/2006/picture">
+                <pic:pic>
+                  <pic:nvPicPr>
+                    <pic:cNvPr id="0" name="image1.png"/>
+                    <pic:cNvPicPr preferRelativeResize="0"/>
+                  </pic:nvPicPr>
+                  <pic:blipFill>
+                    <a:blip r:embed="rId7"/>
+                    <a:srcRect b="0" l="0" r="0" t="0"/>
+                    <a:stretch>
+                      <a:fillRect/>
+                    </a:stretch>
+                  </pic:blipFill>
+                  <pic:spPr>
+                    <a:xfrm>
+                      <a:off x="0" y="0"/>
+                      <a:ext cx="4040958" cy="3348038"/>
+                    </a:xfrm>
+                    <a:prstGeom prst="rect"/>
+                    <a:ln/>
+                  </pic:spPr>
+                </pic:pic>
+              </a:graphicData>
+            </a:graphic>
+          </wp:inline>
+        </w:drawing>
+      </w:r>
+      <w:r>
+        <w:rPr>
+          <w:rtl w:val="0"/>
+        </w:rPr>
+      </w:r>
+    </w:p>
+    <w:p>
+      <w:pPr>
+        <w:rPr/>
+      </w:pPr>
+      <w:r>
+        <w:rPr/>
+        <w:drawing>
+          <wp:inline distB="114300" distT="114300" distL="114300" distR="114300">
+            <wp:extent cx="3833813" cy="3465177"/>
+            <wp:effectExtent b="0" l="0" r="0" t="0"/>
+            <wp:docPr id="4" name="image3.png"/>
             <a:graphic>
               <a:graphicData uri="http://schemas.openxmlformats.org/drawingml/2006/picture">
                 <pic:pic>
@@ -173,7 +133,142 @@
                     <pic:cNvPicPr preferRelativeResize="0"/>
                   </pic:nvPicPr>
                   <pic:blipFill>
-                    <a:blip r:embed="rId7"/>
+                    <a:blip r:embed="rId8"/>
+                    <a:srcRect b="0" l="0" r="0" t="0"/>
+                    <a:stretch>
+                      <a:fillRect/>
+                    </a:stretch>
+                  </pic:blipFill>
+                  <pic:spPr>
+                    <a:xfrm>
+                      <a:off x="0" y="0"/>
+                      <a:ext cx="3833813" cy="3465177"/>
+                    </a:xfrm>
+                    <a:prstGeom prst="rect"/>
+                    <a:ln/>
+                  </pic:spPr>
+                </pic:pic>
+              </a:graphicData>
+            </a:graphic>
+          </wp:inline>
+        </w:drawing>
+      </w:r>
+      <w:r>
+        <w:rPr>
+          <w:rtl w:val="0"/>
+        </w:rPr>
+      </w:r>
+    </w:p>
+    <w:p>
+      <w:pPr>
+        <w:rPr/>
+      </w:pPr>
+      <w:r>
+        <w:rPr>
+          <w:rtl w:val="0"/>
+        </w:rPr>
+      </w:r>
+    </w:p>
+    <w:p>
+      <w:pPr>
+        <w:rPr/>
+      </w:pPr>
+      <w:r>
+        <w:rPr>
+          <w:rtl w:val="0"/>
+        </w:rPr>
+      </w:r>
+    </w:p>
+    <w:p>
+      <w:pPr>
+        <w:rPr/>
+      </w:pPr>
+      <w:r>
+        <w:rPr>
+          <w:rtl w:val="0"/>
+        </w:rPr>
+      </w:r>
+    </w:p>
+    <w:p>
+      <w:pPr>
+        <w:rPr/>
+      </w:pPr>
+      <w:r>
+        <w:rPr>
+          <w:rtl w:val="0"/>
+        </w:rPr>
+      </w:r>
+    </w:p>
+    <w:p>
+      <w:pPr>
+        <w:rPr/>
+      </w:pPr>
+      <w:r>
+        <w:rPr>
+          <w:rtl w:val="0"/>
+        </w:rPr>
+      </w:r>
+    </w:p>
+    <w:p>
+      <w:pPr>
+        <w:rPr/>
+      </w:pPr>
+      <w:r>
+        <w:rPr>
+          <w:rtl w:val="0"/>
+        </w:rPr>
+      </w:r>
+    </w:p>
+    <w:p>
+      <w:pPr>
+        <w:rPr/>
+      </w:pPr>
+      <w:r>
+        <w:rPr>
+          <w:rtl w:val="0"/>
+        </w:rPr>
+      </w:r>
+    </w:p>
+    <w:p>
+      <w:pPr>
+        <w:rPr/>
+      </w:pPr>
+      <w:r>
+        <w:rPr>
+          <w:rtl w:val="0"/>
+        </w:rPr>
+      </w:r>
+    </w:p>
+    <w:p>
+      <w:pPr>
+        <w:rPr/>
+      </w:pPr>
+      <w:r>
+        <w:rPr>
+          <w:rtl w:val="0"/>
+        </w:rPr>
+      </w:r>
+    </w:p>
+    <w:p>
+      <w:pPr>
+        <w:rPr/>
+      </w:pPr>
+      <w:r>
+        <w:rPr/>
+        <w:drawing>
+          <wp:inline distB="114300" distT="114300" distL="114300" distR="114300">
+            <wp:extent cx="3048000" cy="4624388"/>
+            <wp:effectExtent b="0" l="0" r="0" t="0"/>
+            <wp:docPr id="3" name="image5.png"/>
+            <a:graphic>
+              <a:graphicData uri="http://schemas.openxmlformats.org/drawingml/2006/picture">
+                <pic:pic>
+                  <pic:nvPicPr>
+                    <pic:cNvPr id="0" name="image5.png"/>
+                    <pic:cNvPicPr preferRelativeResize="0"/>
+                  </pic:nvPicPr>
+                  <pic:blipFill>
+                    <a:blip r:embed="rId9"/>
                     <a:srcRect b="0" l="0" r="0" t="0"/>
                     <a:stretch>
                       <a:fillRect/>
@@ -208,7 +303,7 @@
                     <pic:cNvPicPr preferRelativeResize="0"/>
                   </pic:nvPicPr>
                   <pic:blipFill>
-                    <a:blip r:embed="rId8"/>
+                    <a:blip r:embed="rId10"/>
                     <a:srcRect b="0" l="0" r="0" t="0"/>
                     <a:stretch>
                       <a:fillRect/>

</xml_diff>